<commit_message>
feat(app): guided-interview template assembly with optional clauses (#52)
Templates now declare optional clauses via an [optional: short-name] marker
appended to a clause heading. list-templates surfaces them separately from
fill placeholders, and draft-document gains an omit arg: named clauses are
removed whole (deleteSection/deleteBlock), kept ones have their marker
stripped. The drafter agent and drafting skill run a guided interview —
prefill from the matter, batch the remaining questions, confirm a term
sheet, then assemble in one draft-document call. The Templates page gains a
Use button that picks a matter and lands in its chat with the drafter
pinned and the assembly prompt prefilled. Seed NDA gains an optional
non-solicitation clause exercised by a new docxodus-level test.
</commit_message>
<xml_diff>
--- a/dochaus/templates/nda.docx
+++ b/dochaus/templates/nda.docx
@@ -124,7 +124,20 @@
         <w:pStyle w:val="Heading2"/>
       </w:pPr>
       <w:r>
-        <w:t xml:space="preserve">9. Entire Agreement</w:t>
+        <w:t xml:space="preserve">9. Non-Solicitation [optional: non-solicitation]</w:t>
+      </w:r>
+    </w:p>
+    <w:p>
+      <w:r>
+        <w:t xml:space="preserve">During the term of this Agreement and for [insert non-solicit period in months] months thereafter, neither Party shall directly or indirectly solicit for employment any employee of the other Party with whom it had contact in connection with the Purpose, provided that general solicitations not directed at such employees shall not breach this Section.</w:t>
+      </w:r>
+    </w:p>
+    <w:p>
+      <w:pPr>
+        <w:pStyle w:val="Heading2"/>
+      </w:pPr>
+      <w:r>
+        <w:t xml:space="preserve">10. Entire Agreement</w:t>
       </w:r>
     </w:p>
     <w:p>

</xml_diff>